<commit_message>
sending the cv ghamasan cv.
</commit_message>
<xml_diff>
--- a/Testing_sites_URL_format.docx
+++ b/Testing_sites_URL_format.docx
@@ -344,15 +344,7 @@
           </w:tcPr>
           <w:p>
             <w:r>
-              <w:t xml:space="preserve">PDF Testing (all plans </w:t>
-            </w:r>
-            <w:proofErr w:type="gramStart"/>
-            <w:r>
-              <w:t>are having</w:t>
-            </w:r>
-            <w:proofErr w:type="gramEnd"/>
-            <w:r>
-              <w:t xml:space="preserve"> pdf)</w:t>
+              <w:t>PDF Testing (all plans are having pdf)</w:t>
             </w:r>
           </w:p>
         </w:tc>
@@ -560,15 +552,7 @@
               <w:t xml:space="preserve">Only Health plans + </w:t>
             </w:r>
             <w:r>
-              <w:t xml:space="preserve">All plans </w:t>
-            </w:r>
-            <w:proofErr w:type="gramStart"/>
-            <w:r>
-              <w:t>are having</w:t>
-            </w:r>
-            <w:proofErr w:type="gramEnd"/>
-            <w:r>
-              <w:t xml:space="preserve"> Behavioural link button. </w:t>
+              <w:t xml:space="preserve">All plans are having Behavioural link button. </w:t>
             </w:r>
           </w:p>
         </w:tc>
@@ -721,16 +705,11 @@
               <w:t xml:space="preserve">See if your drugs are covered via </w:t>
             </w:r>
             <w:proofErr w:type="spellStart"/>
-            <w:proofErr w:type="gramStart"/>
             <w:r>
               <w:t>omni.</w:t>
             </w:r>
             <w:r>
-              <w:t>+</w:t>
-            </w:r>
-            <w:proofErr w:type="gramEnd"/>
-            <w:r>
-              <w:t>Tier</w:t>
+              <w:t>+Tier</w:t>
             </w:r>
             <w:proofErr w:type="spellEnd"/>
             <w:r>
@@ -1004,15 +983,7 @@
           </w:tcPr>
           <w:p>
             <w:r>
-              <w:t xml:space="preserve">Single health </w:t>
-            </w:r>
-            <w:proofErr w:type="gramStart"/>
-            <w:r>
-              <w:t>plan( no</w:t>
-            </w:r>
-            <w:proofErr w:type="gramEnd"/>
-            <w:r>
-              <w:t xml:space="preserve"> cost view). Created without spreadsheet.</w:t>
+              <w:t>Single health plan( no cost view). Created without spreadsheet.</w:t>
             </w:r>
           </w:p>
         </w:tc>
@@ -1105,31 +1076,7 @@
           </w:tcPr>
           <w:p>
             <w:r>
-              <w:t xml:space="preserve">Two surest </w:t>
-            </w:r>
-            <w:proofErr w:type="gramStart"/>
-            <w:r>
-              <w:t>plan</w:t>
-            </w:r>
-            <w:proofErr w:type="gramEnd"/>
-            <w:r>
-              <w:t xml:space="preserve"> only. One is having FSA in its </w:t>
-            </w:r>
-            <w:proofErr w:type="gramStart"/>
-            <w:r>
-              <w:t>CF</w:t>
-            </w:r>
-            <w:proofErr w:type="gramEnd"/>
-            <w:r>
-              <w:t xml:space="preserve"> and another one is not having. </w:t>
-            </w:r>
-            <w:proofErr w:type="gramStart"/>
-            <w:r>
-              <w:t>Yes</w:t>
-            </w:r>
-            <w:proofErr w:type="gramEnd"/>
-            <w:r>
-              <w:t xml:space="preserve"> for supplemental plans. </w:t>
+              <w:t xml:space="preserve">Two surest plan only. One is having FSA in its CF and another one is not having. Yes for supplemental plans. </w:t>
             </w:r>
           </w:p>
         </w:tc>
@@ -1300,15 +1247,7 @@
           </w:tcPr>
           <w:p>
             <w:r>
-              <w:t xml:space="preserve">Two vision </w:t>
-            </w:r>
-            <w:proofErr w:type="gramStart"/>
-            <w:r>
-              <w:t>plan</w:t>
-            </w:r>
-            <w:proofErr w:type="gramEnd"/>
-            <w:r>
-              <w:t xml:space="preserve"> only </w:t>
+              <w:t xml:space="preserve">Two vision plan only </w:t>
             </w:r>
           </w:p>
         </w:tc>
@@ -1406,6 +1345,88 @@
           <w:p/>
         </w:tc>
       </w:tr>
+      <w:tr>
+        <w:trPr>
+          <w:jc w:val="center"/>
+        </w:trPr>
+        <w:tc>
+          <w:tcPr>
+            <w:tcW w:w="2358" w:type="dxa"/>
+          </w:tcPr>
+          <w:p>
+            <w:r>
+              <w:t xml:space="preserve">All </w:t>
+            </w:r>
+            <w:r>
+              <w:t>plans. Not</w:t>
+            </w:r>
+            <w:r>
+              <w:t xml:space="preserve"> applicable too.</w:t>
+            </w:r>
+          </w:p>
+        </w:tc>
+        <w:tc>
+          <w:tcPr>
+            <w:tcW w:w="3314" w:type="dxa"/>
+          </w:tcPr>
+          <w:p/>
+        </w:tc>
+        <w:tc>
+          <w:tcPr>
+            <w:tcW w:w="4768" w:type="dxa"/>
+          </w:tcPr>
+          <w:p>
+            <w:hyperlink r:id="rId41" w:history="1">
+              <w:r>
+                <w:rPr>
+                  <w:rStyle w:val="Hyperlink"/>
+                </w:rPr>
+                <w:t>https://dev.exploreuhcplans.com/30june2026allplans-omnitest/health-plans/plan-details.MDAzLTE2MTUyMS0zMGp1bmUyMDI2YWxscGxhbnMtOHwyMDI3</w:t>
+              </w:r>
+            </w:hyperlink>
+          </w:p>
+          <w:p/>
+          <w:p>
+            <w:r>
+              <w:drawing>
+                <wp:inline distT="0" distB="0" distL="0" distR="0" wp14:anchorId="0C9B5601" wp14:editId="3E3F2E65">
+                  <wp:extent cx="2568163" cy="777307"/>
+                  <wp:effectExtent l="0" t="0" r="3810" b="3810"/>
+                  <wp:docPr id="1297742910" name="Picture 1"/>
+                  <wp:cNvGraphicFramePr>
+                    <a:graphicFrameLocks xmlns:a="http://schemas.openxmlformats.org/drawingml/2006/main" noChangeAspect="1"/>
+                  </wp:cNvGraphicFramePr>
+                  <a:graphic xmlns:a="http://schemas.openxmlformats.org/drawingml/2006/main">
+                    <a:graphicData uri="http://schemas.openxmlformats.org/drawingml/2006/picture">
+                      <pic:pic xmlns:pic="http://schemas.openxmlformats.org/drawingml/2006/picture">
+                        <pic:nvPicPr>
+                          <pic:cNvPr id="1297742910" name=""/>
+                          <pic:cNvPicPr/>
+                        </pic:nvPicPr>
+                        <pic:blipFill>
+                          <a:blip r:embed="rId42"/>
+                          <a:stretch>
+                            <a:fillRect/>
+                          </a:stretch>
+                        </pic:blipFill>
+                        <pic:spPr>
+                          <a:xfrm>
+                            <a:off x="0" y="0"/>
+                            <a:ext cx="2568163" cy="777307"/>
+                          </a:xfrm>
+                          <a:prstGeom prst="rect">
+                            <a:avLst/>
+                          </a:prstGeom>
+                        </pic:spPr>
+                      </pic:pic>
+                    </a:graphicData>
+                  </a:graphic>
+                </wp:inline>
+              </w:drawing>
+            </w:r>
+          </w:p>
+        </w:tc>
+      </w:tr>
     </w:tbl>
     <w:p/>
     <w:p>
@@ -1481,7 +1502,7 @@
             <w:tcW w:w="7325" w:type="dxa"/>
           </w:tcPr>
           <w:p>
-            <w:hyperlink r:id="rId41" w:history="1">
+            <w:hyperlink r:id="rId43" w:history="1">
               <w:r>
                 <w:rPr>
                   <w:rStyle w:val="Hyperlink"/>
@@ -1517,7 +1538,7 @@
             <w:tcW w:w="7325" w:type="dxa"/>
           </w:tcPr>
           <w:p>
-            <w:hyperlink r:id="rId42" w:history="1">
+            <w:hyperlink r:id="rId44" w:history="1">
               <w:r>
                 <w:rPr>
                   <w:rStyle w:val="Hyperlink"/>
@@ -1581,7 +1602,7 @@
             <w:tcW w:w="7325" w:type="dxa"/>
           </w:tcPr>
           <w:p>
-            <w:hyperlink r:id="rId43" w:history="1">
+            <w:hyperlink r:id="rId45" w:history="1">
               <w:r>
                 <w:rPr>
                   <w:rStyle w:val="Hyperlink"/>
@@ -1614,7 +1635,7 @@
             <w:tcW w:w="7325" w:type="dxa"/>
           </w:tcPr>
           <w:p>
-            <w:hyperlink r:id="rId44" w:history="1">
+            <w:hyperlink r:id="rId46" w:history="1">
               <w:r>
                 <w:rPr>
                   <w:rStyle w:val="Hyperlink"/>
@@ -1700,7 +1721,7 @@
             <w:tcW w:w="6198" w:type="dxa"/>
           </w:tcPr>
           <w:p>
-            <w:hyperlink r:id="rId45" w:history="1">
+            <w:hyperlink r:id="rId47" w:history="1">
               <w:r>
                 <w:rPr>
                   <w:rStyle w:val="Hyperlink"/>
@@ -1733,7 +1754,7 @@
             <w:tcW w:w="6198" w:type="dxa"/>
           </w:tcPr>
           <w:p>
-            <w:hyperlink r:id="rId46" w:history="1">
+            <w:hyperlink r:id="rId48" w:history="1">
               <w:r>
                 <w:rPr>
                   <w:rStyle w:val="Hyperlink"/>
@@ -1757,7 +1778,11 @@
           </w:tcPr>
           <w:p>
             <w:r>
-              <w:t>Health + Dental + Supplemental</w:t>
+              <w:t xml:space="preserve">Health + </w:t>
+            </w:r>
+            <w:r>
+              <w:lastRenderedPageBreak/>
+              <w:t>Dental + Supplemental</w:t>
             </w:r>
           </w:p>
         </w:tc>
@@ -1766,7 +1791,7 @@
             <w:tcW w:w="6198" w:type="dxa"/>
           </w:tcPr>
           <w:p>
-            <w:hyperlink r:id="rId47" w:history="1">
+            <w:hyperlink r:id="rId49" w:history="1">
               <w:r>
                 <w:rPr>
                   <w:rStyle w:val="Hyperlink"/>
@@ -1802,7 +1827,7 @@
             <w:tcW w:w="6198" w:type="dxa"/>
           </w:tcPr>
           <w:p>
-            <w:hyperlink r:id="rId48" w:history="1">
+            <w:hyperlink r:id="rId50" w:history="1">
               <w:r>
                 <w:rPr>
                   <w:rStyle w:val="Hyperlink"/>
@@ -1838,7 +1863,7 @@
             <w:tcW w:w="6198" w:type="dxa"/>
           </w:tcPr>
           <w:p>
-            <w:hyperlink r:id="rId49" w:history="1">
+            <w:hyperlink r:id="rId51" w:history="1">
               <w:r>
                 <w:rPr>
                   <w:rStyle w:val="Hyperlink"/>
@@ -1865,11 +1890,7 @@
               <w:t xml:space="preserve">Only </w:t>
             </w:r>
             <w:r>
-              <w:t>Supplementa</w:t>
-            </w:r>
-            <w:r>
-              <w:lastRenderedPageBreak/>
-              <w:t>l Plans</w:t>
+              <w:t>Supplemental Plans</w:t>
             </w:r>
           </w:p>
         </w:tc>
@@ -1878,7 +1899,7 @@
             <w:tcW w:w="6198" w:type="dxa"/>
           </w:tcPr>
           <w:p>
-            <w:hyperlink r:id="rId50" w:history="1">
+            <w:hyperlink r:id="rId52" w:history="1">
               <w:r>
                 <w:rPr>
                   <w:rStyle w:val="Hyperlink"/>
@@ -1911,7 +1932,7 @@
             <w:tcW w:w="6198" w:type="dxa"/>
           </w:tcPr>
           <w:p>
-            <w:hyperlink r:id="rId51" w:history="1">
+            <w:hyperlink r:id="rId53" w:history="1">
               <w:r>
                 <w:rPr>
                   <w:rStyle w:val="Hyperlink"/>
@@ -1944,7 +1965,7 @@
             <w:tcW w:w="6198" w:type="dxa"/>
           </w:tcPr>
           <w:p>
-            <w:hyperlink r:id="rId52" w:history="1">
+            <w:hyperlink r:id="rId54" w:history="1">
               <w:r>
                 <w:rPr>
                   <w:rStyle w:val="Hyperlink"/>
@@ -1989,7 +2010,7 @@
       <w:r>
         <w:t xml:space="preserve">Apple site: </w:t>
       </w:r>
-      <w:hyperlink r:id="rId53" w:history="1">
+      <w:hyperlink r:id="rId55" w:history="1">
         <w:r>
           <w:rPr>
             <w:rStyle w:val="Hyperlink"/>
@@ -2042,7 +2063,7 @@
       <w:r>
         <w:t xml:space="preserve"> on supplemental plans: </w:t>
       </w:r>
-      <w:hyperlink r:id="rId54" w:history="1">
+      <w:hyperlink r:id="rId56" w:history="1">
         <w:r>
           <w:rPr>
             <w:rStyle w:val="Hyperlink"/>

</xml_diff>